<commit_message>
Corrige bugs visuais: RESET nao limpava a tela e painel fechado deixava sombra
O framebuffer do terminal nunca era limpo e o mapa saltava os tiles
desconhecidos, entao o setor anterior continuava visivel depois de um
RESET e o fundo de um painel fechado ficava congelado na tela. Pior:
o mapa era desenhado por cima do HUD, porque a area do mapa nao tinha
offset vertical proprio.

- view.draw_map ganha offset vertical (MAP_TOP = 3) e limpa a propria
  area antes de desenhar
- HUD, mapa e log passam a limpar o espaco que ocupam
- main.draw_scene centraliza o desenho do quadro (limpa a tela inteira
  no inicio) e main.draw_panels concentra os paineis
- teste de regressao em tools/simulate.py: nenhum desenho de tile
  desconhecido sobrevive a um RESET e nenhum pixel de painel sobra
  depois de fechar
- LICENSE (MIT), README e docs atualizados
</commit_message>
<xml_diff>
--- a/docs/RELATORIO-DE-TRABALHO.docx
+++ b/docs/RELATORIO-DE-TRABALHO.docx
@@ -4403,6 +4403,39 @@
     </w:p>
     <w:p>
       <w:pPr>
+        <w:pStyle w:val="ListBullet"/>
+      </w:pPr>
+      <w:r>
+        <w:t>O RESET nao limpava a tela: o setor novo nascia em cima do desenho antigo. O framebuffer do terminal nunca era limpo e o mapa saltava os tiles desconhecidos, entao tudo que ficava na tela continuava visivel.</w:t>
+      </w:r>
+    </w:p>
+    <w:p>
+      <w:pPr>
+        <w:pStyle w:val="ListBullet"/>
+      </w:pPr>
+      <w:r>
+        <w:t>O painel de inventario e o de ajuda deixavam sombra na tela ao serem fechados, pelo mesmo motivo: o mapa so redesenhava os tiles que ainda conhecia.</w:t>
+      </w:r>
+    </w:p>
+    <w:p>
+      <w:pPr>
+        <w:pStyle w:val="ListBullet"/>
+      </w:pPr>
+      <w:r>
+        <w:t>O mapa era desenhado por cima do HUD, porque a area do mapa nao tinha offset vertical proprio.</w:t>
+      </w:r>
+    </w:p>
+    <w:p>
+      <w:r>
+        <w:rPr>
+          <w:b w:val="0"/>
+          <w:i w:val="0"/>
+        </w:rPr>
+        <w:t>A correcao dos tres defeitos visuais foi estrutural: o quadro do jogo passou a ser desenhado por uma unica funcao (draw_scene) que limpa a tela inteira antes de desenhar, a area do mapa ganhou offset vertical (MAP_TOP = 3, logo abaixo do HUD) e cada regiao (HUD, mapa, log) limpa o proprio espaco antes de escrever. O teste de regressao confere as duas queixas: nenhum desenho de tile desconhecido sobrevive a um RESET e nenhum pixel de painel sobra depois de fechar.</w:t>
+      </w:r>
+    </w:p>
+    <w:p>
+      <w:pPr>
         <w:pStyle w:val="Heading1"/>
       </w:pPr>
       <w:r>
@@ -4456,6 +4489,14 @@
       </w:pPr>
       <w:r>
         <w:t>Render: titulo, mapa, HUD e paineis em todos os modos de cor; saida compativel com CP437; HUD cabe em 80 colunas.</w:t>
+      </w:r>
+    </w:p>
+    <w:p>
+      <w:pPr>
+        <w:pStyle w:val="ListBullet"/>
+      </w:pPr>
+      <w:r>
+        <w:t>Limpeza visual: nenhum desenho de tile desconhecido sobrevive a um RESET, nenhum pixel de painel sobra depois de fechar e o mapa nunca invade as linhas do HUD.</w:t>
       </w:r>
     </w:p>
     <w:p>

</xml_diff>